<commit_message>
Add Figma wireframe links for the 20 Currency Switch screens (Step 5.5)
Writes each frame link into the Design column of 3.6 Screens and
re-exports the DOCX.

Co-Authored-By: Claude Opus 5.5 <noreply@anthropic.com>
Claude-Session: https://claude.ai/code/session_01EzrvGHwwtBBiNr4ri5n3YE
</commit_message>
<xml_diff>
--- a/domain-knowledge/currency-switch/PRDs/currency-switch_PRD.docx
+++ b/domain-knowledge/currency-switch/PRDs/currency-switch_PRD.docx
@@ -28,7 +28,7 @@
         </w:p>
       </w:sdtContent>
     </w:sdt>
-    <w:bookmarkStart w:id="42" w:name="vexere---currency-switch-prd"/>
+    <w:bookmarkStart w:id="62" w:name="vexere---currency-switch-prd"/>
     <w:p>
       <w:pPr>
         <w:pStyle w:val="Heading1"/>
@@ -4238,7 +4238,7 @@
     </w:p>
     <w:bookmarkEnd w:id="29"/>
     <w:bookmarkEnd w:id="30"/>
-    <w:bookmarkStart w:id="40" w:name="feature-specifications"/>
+    <w:bookmarkStart w:id="60" w:name="feature-specifications"/>
     <w:p>
       <w:pPr>
         <w:pStyle w:val="Heading2"/>
@@ -29741,7 +29741,7 @@
     </w:p>
     <w:bookmarkEnd w:id="36"/>
     <w:bookmarkEnd w:id="37"/>
-    <w:bookmarkStart w:id="38" w:name="uiux-specifications"/>
+    <w:bookmarkStart w:id="58" w:name="uiux-specifications"/>
     <w:p>
       <w:pPr>
         <w:pStyle w:val="Heading3"/>
@@ -29895,7 +29895,22 @@
           <w:p>
             <w:pPr>
               <w:pStyle w:val="Compact"/>
-            </w:pPr>
+              <w:jc w:val="left"/>
+            </w:pPr>
+            <w:hyperlink r:id="rId38">
+              <w:r>
+                <w:rPr>
+                  <w:rStyle w:val="Hyperlink"/>
+                </w:rPr>
+                <w:t xml:space="preserve">Figma</w:t>
+              </w:r>
+            </w:hyperlink>
+            <w:r>
+              <w:t xml:space="preserve"> </w:t>
+            </w:r>
+            <w:r>
+              <w:t xml:space="preserve">(wireframe)</w:t>
+            </w:r>
           </w:p>
         </w:tc>
       </w:tr>
@@ -29953,7 +29968,22 @@
           <w:p>
             <w:pPr>
               <w:pStyle w:val="Compact"/>
-            </w:pPr>
+              <w:jc w:val="left"/>
+            </w:pPr>
+            <w:hyperlink r:id="rId39">
+              <w:r>
+                <w:rPr>
+                  <w:rStyle w:val="Hyperlink"/>
+                </w:rPr>
+                <w:t xml:space="preserve">Figma</w:t>
+              </w:r>
+            </w:hyperlink>
+            <w:r>
+              <w:t xml:space="preserve"> </w:t>
+            </w:r>
+            <w:r>
+              <w:t xml:space="preserve">(wireframe)</w:t>
+            </w:r>
           </w:p>
         </w:tc>
       </w:tr>
@@ -30011,7 +30041,22 @@
           <w:p>
             <w:pPr>
               <w:pStyle w:val="Compact"/>
-            </w:pPr>
+              <w:jc w:val="left"/>
+            </w:pPr>
+            <w:hyperlink r:id="rId40">
+              <w:r>
+                <w:rPr>
+                  <w:rStyle w:val="Hyperlink"/>
+                </w:rPr>
+                <w:t xml:space="preserve">Figma</w:t>
+              </w:r>
+            </w:hyperlink>
+            <w:r>
+              <w:t xml:space="preserve"> </w:t>
+            </w:r>
+            <w:r>
+              <w:t xml:space="preserve">(wireframe)</w:t>
+            </w:r>
           </w:p>
         </w:tc>
       </w:tr>
@@ -30069,7 +30114,22 @@
           <w:p>
             <w:pPr>
               <w:pStyle w:val="Compact"/>
-            </w:pPr>
+              <w:jc w:val="left"/>
+            </w:pPr>
+            <w:hyperlink r:id="rId41">
+              <w:r>
+                <w:rPr>
+                  <w:rStyle w:val="Hyperlink"/>
+                </w:rPr>
+                <w:t xml:space="preserve">Figma</w:t>
+              </w:r>
+            </w:hyperlink>
+            <w:r>
+              <w:t xml:space="preserve"> </w:t>
+            </w:r>
+            <w:r>
+              <w:t xml:space="preserve">(wireframe)</w:t>
+            </w:r>
           </w:p>
         </w:tc>
       </w:tr>
@@ -30127,7 +30187,22 @@
           <w:p>
             <w:pPr>
               <w:pStyle w:val="Compact"/>
-            </w:pPr>
+              <w:jc w:val="left"/>
+            </w:pPr>
+            <w:hyperlink r:id="rId42">
+              <w:r>
+                <w:rPr>
+                  <w:rStyle w:val="Hyperlink"/>
+                </w:rPr>
+                <w:t xml:space="preserve">Figma</w:t>
+              </w:r>
+            </w:hyperlink>
+            <w:r>
+              <w:t xml:space="preserve"> </w:t>
+            </w:r>
+            <w:r>
+              <w:t xml:space="preserve">(wireframe)</w:t>
+            </w:r>
           </w:p>
         </w:tc>
       </w:tr>
@@ -30185,7 +30260,22 @@
           <w:p>
             <w:pPr>
               <w:pStyle w:val="Compact"/>
-            </w:pPr>
+              <w:jc w:val="left"/>
+            </w:pPr>
+            <w:hyperlink r:id="rId43">
+              <w:r>
+                <w:rPr>
+                  <w:rStyle w:val="Hyperlink"/>
+                </w:rPr>
+                <w:t xml:space="preserve">Figma</w:t>
+              </w:r>
+            </w:hyperlink>
+            <w:r>
+              <w:t xml:space="preserve"> </w:t>
+            </w:r>
+            <w:r>
+              <w:t xml:space="preserve">(wireframe)</w:t>
+            </w:r>
           </w:p>
         </w:tc>
       </w:tr>
@@ -30243,7 +30333,22 @@
           <w:p>
             <w:pPr>
               <w:pStyle w:val="Compact"/>
-            </w:pPr>
+              <w:jc w:val="left"/>
+            </w:pPr>
+            <w:hyperlink r:id="rId44">
+              <w:r>
+                <w:rPr>
+                  <w:rStyle w:val="Hyperlink"/>
+                </w:rPr>
+                <w:t xml:space="preserve">Figma</w:t>
+              </w:r>
+            </w:hyperlink>
+            <w:r>
+              <w:t xml:space="preserve"> </w:t>
+            </w:r>
+            <w:r>
+              <w:t xml:space="preserve">(wireframe)</w:t>
+            </w:r>
           </w:p>
         </w:tc>
       </w:tr>
@@ -30301,7 +30406,22 @@
           <w:p>
             <w:pPr>
               <w:pStyle w:val="Compact"/>
-            </w:pPr>
+              <w:jc w:val="left"/>
+            </w:pPr>
+            <w:hyperlink r:id="rId45">
+              <w:r>
+                <w:rPr>
+                  <w:rStyle w:val="Hyperlink"/>
+                </w:rPr>
+                <w:t xml:space="preserve">Figma</w:t>
+              </w:r>
+            </w:hyperlink>
+            <w:r>
+              <w:t xml:space="preserve"> </w:t>
+            </w:r>
+            <w:r>
+              <w:t xml:space="preserve">(wireframe)</w:t>
+            </w:r>
           </w:p>
         </w:tc>
       </w:tr>
@@ -30359,7 +30479,22 @@
           <w:p>
             <w:pPr>
               <w:pStyle w:val="Compact"/>
-            </w:pPr>
+              <w:jc w:val="left"/>
+            </w:pPr>
+            <w:hyperlink r:id="rId46">
+              <w:r>
+                <w:rPr>
+                  <w:rStyle w:val="Hyperlink"/>
+                </w:rPr>
+                <w:t xml:space="preserve">Figma</w:t>
+              </w:r>
+            </w:hyperlink>
+            <w:r>
+              <w:t xml:space="preserve"> </w:t>
+            </w:r>
+            <w:r>
+              <w:t xml:space="preserve">(wireframe)</w:t>
+            </w:r>
           </w:p>
         </w:tc>
       </w:tr>
@@ -30417,7 +30552,22 @@
           <w:p>
             <w:pPr>
               <w:pStyle w:val="Compact"/>
-            </w:pPr>
+              <w:jc w:val="left"/>
+            </w:pPr>
+            <w:hyperlink r:id="rId47">
+              <w:r>
+                <w:rPr>
+                  <w:rStyle w:val="Hyperlink"/>
+                </w:rPr>
+                <w:t xml:space="preserve">Figma</w:t>
+              </w:r>
+            </w:hyperlink>
+            <w:r>
+              <w:t xml:space="preserve"> </w:t>
+            </w:r>
+            <w:r>
+              <w:t xml:space="preserve">(wireframe)</w:t>
+            </w:r>
           </w:p>
         </w:tc>
       </w:tr>
@@ -30475,7 +30625,22 @@
           <w:p>
             <w:pPr>
               <w:pStyle w:val="Compact"/>
-            </w:pPr>
+              <w:jc w:val="left"/>
+            </w:pPr>
+            <w:hyperlink r:id="rId48">
+              <w:r>
+                <w:rPr>
+                  <w:rStyle w:val="Hyperlink"/>
+                </w:rPr>
+                <w:t xml:space="preserve">Figma</w:t>
+              </w:r>
+            </w:hyperlink>
+            <w:r>
+              <w:t xml:space="preserve"> </w:t>
+            </w:r>
+            <w:r>
+              <w:t xml:space="preserve">(wireframe)</w:t>
+            </w:r>
           </w:p>
         </w:tc>
       </w:tr>
@@ -30533,7 +30698,22 @@
           <w:p>
             <w:pPr>
               <w:pStyle w:val="Compact"/>
-            </w:pPr>
+              <w:jc w:val="left"/>
+            </w:pPr>
+            <w:hyperlink r:id="rId49">
+              <w:r>
+                <w:rPr>
+                  <w:rStyle w:val="Hyperlink"/>
+                </w:rPr>
+                <w:t xml:space="preserve">Figma</w:t>
+              </w:r>
+            </w:hyperlink>
+            <w:r>
+              <w:t xml:space="preserve"> </w:t>
+            </w:r>
+            <w:r>
+              <w:t xml:space="preserve">(wireframe)</w:t>
+            </w:r>
           </w:p>
         </w:tc>
       </w:tr>
@@ -30591,7 +30771,22 @@
           <w:p>
             <w:pPr>
               <w:pStyle w:val="Compact"/>
-            </w:pPr>
+              <w:jc w:val="left"/>
+            </w:pPr>
+            <w:hyperlink r:id="rId50">
+              <w:r>
+                <w:rPr>
+                  <w:rStyle w:val="Hyperlink"/>
+                </w:rPr>
+                <w:t xml:space="preserve">Figma</w:t>
+              </w:r>
+            </w:hyperlink>
+            <w:r>
+              <w:t xml:space="preserve"> </w:t>
+            </w:r>
+            <w:r>
+              <w:t xml:space="preserve">(wireframe)</w:t>
+            </w:r>
           </w:p>
         </w:tc>
       </w:tr>
@@ -30649,7 +30844,22 @@
           <w:p>
             <w:pPr>
               <w:pStyle w:val="Compact"/>
-            </w:pPr>
+              <w:jc w:val="left"/>
+            </w:pPr>
+            <w:hyperlink r:id="rId51">
+              <w:r>
+                <w:rPr>
+                  <w:rStyle w:val="Hyperlink"/>
+                </w:rPr>
+                <w:t xml:space="preserve">Figma</w:t>
+              </w:r>
+            </w:hyperlink>
+            <w:r>
+              <w:t xml:space="preserve"> </w:t>
+            </w:r>
+            <w:r>
+              <w:t xml:space="preserve">(wireframe)</w:t>
+            </w:r>
           </w:p>
         </w:tc>
       </w:tr>
@@ -30707,7 +30917,22 @@
           <w:p>
             <w:pPr>
               <w:pStyle w:val="Compact"/>
-            </w:pPr>
+              <w:jc w:val="left"/>
+            </w:pPr>
+            <w:hyperlink r:id="rId52">
+              <w:r>
+                <w:rPr>
+                  <w:rStyle w:val="Hyperlink"/>
+                </w:rPr>
+                <w:t xml:space="preserve">Figma</w:t>
+              </w:r>
+            </w:hyperlink>
+            <w:r>
+              <w:t xml:space="preserve"> </w:t>
+            </w:r>
+            <w:r>
+              <w:t xml:space="preserve">(wireframe)</w:t>
+            </w:r>
           </w:p>
         </w:tc>
       </w:tr>
@@ -30765,7 +30990,22 @@
           <w:p>
             <w:pPr>
               <w:pStyle w:val="Compact"/>
-            </w:pPr>
+              <w:jc w:val="left"/>
+            </w:pPr>
+            <w:hyperlink r:id="rId53">
+              <w:r>
+                <w:rPr>
+                  <w:rStyle w:val="Hyperlink"/>
+                </w:rPr>
+                <w:t xml:space="preserve">Figma</w:t>
+              </w:r>
+            </w:hyperlink>
+            <w:r>
+              <w:t xml:space="preserve"> </w:t>
+            </w:r>
+            <w:r>
+              <w:t xml:space="preserve">(wireframe)</w:t>
+            </w:r>
           </w:p>
         </w:tc>
       </w:tr>
@@ -30823,7 +31063,22 @@
           <w:p>
             <w:pPr>
               <w:pStyle w:val="Compact"/>
-            </w:pPr>
+              <w:jc w:val="left"/>
+            </w:pPr>
+            <w:hyperlink r:id="rId54">
+              <w:r>
+                <w:rPr>
+                  <w:rStyle w:val="Hyperlink"/>
+                </w:rPr>
+                <w:t xml:space="preserve">Figma</w:t>
+              </w:r>
+            </w:hyperlink>
+            <w:r>
+              <w:t xml:space="preserve"> </w:t>
+            </w:r>
+            <w:r>
+              <w:t xml:space="preserve">(wireframe)</w:t>
+            </w:r>
           </w:p>
         </w:tc>
       </w:tr>
@@ -30881,7 +31136,22 @@
           <w:p>
             <w:pPr>
               <w:pStyle w:val="Compact"/>
-            </w:pPr>
+              <w:jc w:val="left"/>
+            </w:pPr>
+            <w:hyperlink r:id="rId55">
+              <w:r>
+                <w:rPr>
+                  <w:rStyle w:val="Hyperlink"/>
+                </w:rPr>
+                <w:t xml:space="preserve">Figma</w:t>
+              </w:r>
+            </w:hyperlink>
+            <w:r>
+              <w:t xml:space="preserve"> </w:t>
+            </w:r>
+            <w:r>
+              <w:t xml:space="preserve">(wireframe)</w:t>
+            </w:r>
           </w:p>
         </w:tc>
       </w:tr>
@@ -30939,7 +31209,22 @@
           <w:p>
             <w:pPr>
               <w:pStyle w:val="Compact"/>
-            </w:pPr>
+              <w:jc w:val="left"/>
+            </w:pPr>
+            <w:hyperlink r:id="rId56">
+              <w:r>
+                <w:rPr>
+                  <w:rStyle w:val="Hyperlink"/>
+                </w:rPr>
+                <w:t xml:space="preserve">Figma</w:t>
+              </w:r>
+            </w:hyperlink>
+            <w:r>
+              <w:t xml:space="preserve"> </w:t>
+            </w:r>
+            <w:r>
+              <w:t xml:space="preserve">(wireframe)</w:t>
+            </w:r>
           </w:p>
         </w:tc>
       </w:tr>
@@ -30997,7 +31282,22 @@
           <w:p>
             <w:pPr>
               <w:pStyle w:val="Compact"/>
-            </w:pPr>
+              <w:jc w:val="left"/>
+            </w:pPr>
+            <w:hyperlink r:id="rId57">
+              <w:r>
+                <w:rPr>
+                  <w:rStyle w:val="Hyperlink"/>
+                </w:rPr>
+                <w:t xml:space="preserve">Figma</w:t>
+              </w:r>
+            </w:hyperlink>
+            <w:r>
+              <w:t xml:space="preserve"> </w:t>
+            </w:r>
+            <w:r>
+              <w:t xml:space="preserve">(wireframe)</w:t>
+            </w:r>
           </w:p>
         </w:tc>
       </w:tr>
@@ -32450,8 +32750,8 @@
         </w:pict>
       </w:r>
     </w:p>
-    <w:bookmarkEnd w:id="38"/>
-    <w:bookmarkStart w:id="39" w:name="dependencies-impacted-areas"/>
+    <w:bookmarkEnd w:id="58"/>
+    <w:bookmarkStart w:id="59" w:name="dependencies-impacted-areas"/>
     <w:p>
       <w:pPr>
         <w:pStyle w:val="Heading3"/>
@@ -34093,9 +34393,9 @@
         </w:pict>
       </w:r>
     </w:p>
-    <w:bookmarkEnd w:id="39"/>
-    <w:bookmarkEnd w:id="40"/>
-    <w:bookmarkStart w:id="41" w:name="assumptions-open-questions"/>
+    <w:bookmarkEnd w:id="59"/>
+    <w:bookmarkEnd w:id="60"/>
+    <w:bookmarkStart w:id="61" w:name="assumptions-open-questions"/>
     <w:p>
       <w:pPr>
         <w:pStyle w:val="Heading2"/>
@@ -38401,8 +38701,8 @@
         <w:t xml:space="preserve">Document generated using the PRD template renderer.</w:t>
       </w:r>
     </w:p>
-    <w:bookmarkEnd w:id="41"/>
-    <w:bookmarkEnd w:id="42"/>
+    <w:bookmarkEnd w:id="61"/>
+    <w:bookmarkEnd w:id="62"/>
     <w:sectPr/>
   </w:body>
 </w:document>

</xml_diff>